<commit_message>
Fix Word docx schema validation corruption and generate clean document structure
</commit_message>
<xml_diff>
--- a/assets/Naveen_Mandula_Resume.docx
+++ b/assets/Naveen_Mandula_Resume.docx
@@ -101,9 +101,6 @@
       <w:pPr>
         <w:keepNext/>
         <w:spacing w:before="240" w:after="80"/>
-        <w:pBdr>
-          <w:bottom w:val="single" w:sz="12" w:space="1" w:color="1E3A8A"/>
-        </w:pBdr>
       </w:pPr>
       <w:r>
         <w:rPr>
@@ -131,9 +128,6 @@
       <w:pPr>
         <w:keepNext/>
         <w:spacing w:before="240" w:after="80"/>
-        <w:pBdr>
-          <w:bottom w:val="single" w:sz="12" w:space="1" w:color="1E3A8A"/>
-        </w:pBdr>
       </w:pPr>
       <w:r>
         <w:rPr>
@@ -269,9 +263,6 @@
       <w:pPr>
         <w:keepNext/>
         <w:spacing w:before="240" w:after="80"/>
-        <w:pBdr>
-          <w:bottom w:val="single" w:sz="12" w:space="1" w:color="1E3A8A"/>
-        </w:pBdr>
       </w:pPr>
       <w:r>
         <w:rPr>
@@ -905,9 +896,6 @@
       <w:pPr>
         <w:keepNext/>
         <w:spacing w:before="240" w:after="80"/>
-        <w:pBdr>
-          <w:bottom w:val="single" w:sz="12" w:space="1" w:color="1E3A8A"/>
-        </w:pBdr>
       </w:pPr>
       <w:r>
         <w:rPr>

</xml_diff>

<commit_message>
Commit compiled PDF and DOCX resumes with lowercase link labels
</commit_message>
<xml_diff>
--- a/assets/Naveen_Mandula_Resume.docx
+++ b/assets/Naveen_Mandula_Resume.docx
@@ -61,7 +61,7 @@
             <w:color w:val="0284C7"/>
             <w:u w:val="single"/>
           </w:rPr>
-          <w:t>LinkedIn</w:t>
+          <w:t>linkedin</w:t>
         </w:r>
       </w:hyperlink>
       <w:r>
@@ -77,7 +77,7 @@
             <w:color w:val="0284C7"/>
             <w:u w:val="single"/>
           </w:rPr>
-          <w:t>GitHub</w:t>
+          <w:t>github</w:t>
         </w:r>
       </w:hyperlink>
       <w:r>
@@ -93,7 +93,7 @@
             <w:color w:val="0284C7"/>
             <w:u w:val="single"/>
           </w:rPr>
-          <w:t>Portfolio</w:t>
+          <w:t>portfolio</w:t>
         </w:r>
       </w:hyperlink>
     </w:p>

</xml_diff>